<commit_message>
Yayin: sihhi tesisat kalemleri fiyatlandirildi
Co-Authored-By: Claude Opus 5 <noreply@anthropic.com>
Claude-Session: https://claude.ai/code/session_01HJPp6bx7wepUX5p8fxGcjg
</commit_message>
<xml_diff>
--- a/belgeler/45_B2_IS_PLANI.docx
+++ b/belgeler/45_B2_IS_PLANI.docx
@@ -2618,7 +2618,7 @@
                 <w:color w:val="000000"/>
                 <w:sz w:val="16"/>
               </w:rPr>
-              <w:t>5.618.052,75</w:t>
+              <w:t>6.216.052,75</w:t>
             </w:r>
           </w:p>
         </w:tc>
@@ -2645,7 +2645,7 @@
                 <w:color w:val="000000"/>
                 <w:sz w:val="16"/>
               </w:rPr>
-              <w:t>106.486</w:t>
+              <w:t>117.821</w:t>
             </w:r>
           </w:p>
         </w:tc>
@@ -2948,7 +2948,7 @@
                 <w:color w:val="000000"/>
                 <w:sz w:val="16"/>
               </w:rPr>
-              <w:t>24.988.354,46</w:t>
+              <w:t>25.586.354,46</w:t>
             </w:r>
           </w:p>
         </w:tc>
@@ -2975,7 +2975,7 @@
                 <w:color w:val="000000"/>
                 <w:sz w:val="16"/>
               </w:rPr>
-              <w:t>473.637</w:t>
+              <w:t>484.971</w:t>
             </w:r>
           </w:p>
         </w:tc>
@@ -3157,7 +3157,7 @@
                 <w:color w:val="000000"/>
                 <w:sz w:val="16"/>
               </w:rPr>
-              <w:t>24.988.354,46</w:t>
+              <w:t>25.586.354,46</w:t>
             </w:r>
           </w:p>
         </w:tc>
@@ -5794,7 +5794,7 @@
           <w:color w:val="000000"/>
           <w:sz w:val="18"/>
         </w:rPr>
-        <w:t>512.721,23 TL</w:t>
+        <w:t>513.831,80 TL</w:t>
       </w:r>
       <w:r>
         <w:rPr>
@@ -6621,7 +6621,7 @@
                 <w:color w:val="000000"/>
                 <w:sz w:val="16"/>
               </w:rPr>
-              <w:t>1.087.083,54</w:t>
+              <w:t>1.093.063,54</w:t>
             </w:r>
           </w:p>
         </w:tc>
@@ -6704,7 +6704,7 @@
                 <w:color w:val="000000"/>
                 <w:sz w:val="16"/>
               </w:rPr>
-              <w:t>254.965,06</w:t>
+              <w:t>256.759,06</w:t>
             </w:r>
           </w:p>
         </w:tc>
@@ -6953,7 +6953,7 @@
                 <w:color w:val="000000"/>
                 <w:sz w:val="16"/>
               </w:rPr>
-              <w:t>3.589.048,60</w:t>
+              <w:t>3.596.822,60</w:t>
             </w:r>
           </w:p>
         </w:tc>
@@ -7179,7 +7179,7 @@
                 <w:color w:val="000000"/>
                 <w:sz w:val="16"/>
               </w:rPr>
-              <w:t>21.392.507,25</w:t>
+              <w:t>21.990.507,25</w:t>
             </w:r>
           </w:p>
         </w:tc>
@@ -7233,7 +7233,7 @@
                 <w:color w:val="000000"/>
                 <w:sz w:val="16"/>
               </w:rPr>
-              <w:t>427.850,15</w:t>
+              <w:t>439.810,15</w:t>
             </w:r>
           </w:p>
         </w:tc>
@@ -7399,7 +7399,7 @@
                 <w:color w:val="000000"/>
                 <w:sz w:val="16"/>
               </w:rPr>
-              <w:t>24.988.354,46</w:t>
+              <w:t>25.586.354,46</w:t>
             </w:r>
           </w:p>
         </w:tc>
@@ -7443,7 +7443,7 @@
                 <w:color w:val="000000"/>
                 <w:sz w:val="16"/>
               </w:rPr>
-              <w:t>787.434,87</w:t>
+              <w:t>799.394,87</w:t>
             </w:r>
           </w:p>
         </w:tc>
@@ -9361,7 +9361,7 @@
                 <w:color w:val="000000"/>
                 <w:sz w:val="16"/>
               </w:rPr>
-              <w:t>1.087.083,54</w:t>
+              <w:t>1.093.063,54</w:t>
             </w:r>
           </w:p>
         </w:tc>
@@ -9388,7 +9388,7 @@
                 <w:color w:val="000000"/>
                 <w:sz w:val="16"/>
               </w:rPr>
-              <w:t>1.087.083,54</w:t>
+              <w:t>1.093.063,54</w:t>
             </w:r>
           </w:p>
         </w:tc>
@@ -9415,7 +9415,7 @@
                 <w:color w:val="000000"/>
                 <w:sz w:val="16"/>
               </w:rPr>
-              <w:t>1.087.083,54</w:t>
+              <w:t>1.093.063,54</w:t>
             </w:r>
           </w:p>
         </w:tc>
@@ -9442,7 +9442,7 @@
                 <w:color w:val="000000"/>
                 <w:sz w:val="16"/>
               </w:rPr>
-              <w:t>1.087.083,54</w:t>
+              <w:t>1.093.063,54</w:t>
             </w:r>
           </w:p>
         </w:tc>
@@ -9469,7 +9469,7 @@
                 <w:color w:val="000000"/>
                 <w:sz w:val="16"/>
               </w:rPr>
-              <w:t>1.087.083,54</w:t>
+              <w:t>1.093.063,54</w:t>
             </w:r>
           </w:p>
         </w:tc>
@@ -9496,7 +9496,7 @@
                 <w:color w:val="000000"/>
                 <w:sz w:val="16"/>
               </w:rPr>
-              <w:t>1.087.083,54</w:t>
+              <w:t>1.093.063,54</w:t>
             </w:r>
           </w:p>
         </w:tc>
@@ -9523,7 +9523,7 @@
                 <w:color w:val="000000"/>
                 <w:sz w:val="16"/>
               </w:rPr>
-              <w:t>1.087.083,54</w:t>
+              <w:t>1.093.063,54</w:t>
             </w:r>
           </w:p>
         </w:tc>
@@ -9550,7 +9550,7 @@
                 <w:color w:val="000000"/>
                 <w:sz w:val="16"/>
               </w:rPr>
-              <w:t>1.087.083,54</w:t>
+              <w:t>1.093.063,54</w:t>
             </w:r>
           </w:p>
         </w:tc>
@@ -9577,7 +9577,7 @@
                 <w:color w:val="000000"/>
                 <w:sz w:val="16"/>
               </w:rPr>
-              <w:t>1.087.083,54</w:t>
+              <w:t>1.093.063,54</w:t>
             </w:r>
           </w:p>
         </w:tc>
@@ -9604,7 +9604,7 @@
                 <w:color w:val="000000"/>
                 <w:sz w:val="16"/>
               </w:rPr>
-              <w:t>1.087.083,54</w:t>
+              <w:t>1.093.063,54</w:t>
             </w:r>
           </w:p>
         </w:tc>
@@ -9660,7 +9660,7 @@
                 <w:color w:val="000000"/>
                 <w:sz w:val="16"/>
               </w:rPr>
-              <w:t>254.965,06</w:t>
+              <w:t>256.759,06</w:t>
             </w:r>
           </w:p>
         </w:tc>
@@ -9687,7 +9687,7 @@
                 <w:color w:val="000000"/>
                 <w:sz w:val="16"/>
               </w:rPr>
-              <w:t>254.965,06</w:t>
+              <w:t>256.759,06</w:t>
             </w:r>
           </w:p>
         </w:tc>
@@ -9714,7 +9714,7 @@
                 <w:color w:val="000000"/>
                 <w:sz w:val="16"/>
               </w:rPr>
-              <w:t>254.965,06</w:t>
+              <w:t>256.759,06</w:t>
             </w:r>
           </w:p>
         </w:tc>
@@ -9741,7 +9741,7 @@
                 <w:color w:val="000000"/>
                 <w:sz w:val="16"/>
               </w:rPr>
-              <w:t>254.965,06</w:t>
+              <w:t>256.759,06</w:t>
             </w:r>
           </w:p>
         </w:tc>
@@ -9768,7 +9768,7 @@
                 <w:color w:val="000000"/>
                 <w:sz w:val="16"/>
               </w:rPr>
-              <w:t>254.965,06</w:t>
+              <w:t>256.759,06</w:t>
             </w:r>
           </w:p>
         </w:tc>
@@ -9795,7 +9795,7 @@
                 <w:color w:val="000000"/>
                 <w:sz w:val="16"/>
               </w:rPr>
-              <w:t>254.965,06</w:t>
+              <w:t>256.759,06</w:t>
             </w:r>
           </w:p>
         </w:tc>
@@ -9822,7 +9822,7 @@
                 <w:color w:val="000000"/>
                 <w:sz w:val="16"/>
               </w:rPr>
-              <w:t>254.965,06</w:t>
+              <w:t>256.759,06</w:t>
             </w:r>
           </w:p>
         </w:tc>
@@ -9849,7 +9849,7 @@
                 <w:color w:val="000000"/>
                 <w:sz w:val="16"/>
               </w:rPr>
-              <w:t>254.965,06</w:t>
+              <w:t>256.759,06</w:t>
             </w:r>
           </w:p>
         </w:tc>
@@ -9876,7 +9876,7 @@
                 <w:color w:val="000000"/>
                 <w:sz w:val="16"/>
               </w:rPr>
-              <w:t>254.965,06</w:t>
+              <w:t>256.759,06</w:t>
             </w:r>
           </w:p>
         </w:tc>
@@ -9903,7 +9903,7 @@
                 <w:color w:val="000000"/>
                 <w:sz w:val="16"/>
               </w:rPr>
-              <w:t>254.965,06</w:t>
+              <w:t>256.759,06</w:t>
             </w:r>
           </w:p>
         </w:tc>
@@ -10557,7 +10557,7 @@
                 <w:color w:val="000000"/>
                 <w:sz w:val="16"/>
               </w:rPr>
-              <w:t>787.434,87</w:t>
+              <w:t>799.394,87</w:t>
             </w:r>
           </w:p>
         </w:tc>
@@ -10584,7 +10584,7 @@
                 <w:color w:val="000000"/>
                 <w:sz w:val="16"/>
               </w:rPr>
-              <w:t>787.434,87</w:t>
+              <w:t>799.394,87</w:t>
             </w:r>
           </w:p>
         </w:tc>
@@ -10611,7 +10611,7 @@
                 <w:color w:val="000000"/>
                 <w:sz w:val="16"/>
               </w:rPr>
-              <w:t>787.434,87</w:t>
+              <w:t>799.394,87</w:t>
             </w:r>
           </w:p>
         </w:tc>
@@ -10638,7 +10638,7 @@
                 <w:color w:val="000000"/>
                 <w:sz w:val="16"/>
               </w:rPr>
-              <w:t>787.434,87</w:t>
+              <w:t>799.394,87</w:t>
             </w:r>
           </w:p>
         </w:tc>
@@ -10665,7 +10665,7 @@
                 <w:color w:val="000000"/>
                 <w:sz w:val="16"/>
               </w:rPr>
-              <w:t>787.434,87</w:t>
+              <w:t>799.394,87</w:t>
             </w:r>
           </w:p>
         </w:tc>
@@ -10692,7 +10692,7 @@
                 <w:color w:val="000000"/>
                 <w:sz w:val="16"/>
               </w:rPr>
-              <w:t>787.434,87</w:t>
+              <w:t>799.394,87</w:t>
             </w:r>
           </w:p>
         </w:tc>
@@ -10719,7 +10719,7 @@
                 <w:color w:val="000000"/>
                 <w:sz w:val="16"/>
               </w:rPr>
-              <w:t>787.434,87</w:t>
+              <w:t>799.394,87</w:t>
             </w:r>
           </w:p>
         </w:tc>
@@ -10746,7 +10746,7 @@
                 <w:color w:val="000000"/>
                 <w:sz w:val="16"/>
               </w:rPr>
-              <w:t>787.434,87</w:t>
+              <w:t>799.394,87</w:t>
             </w:r>
           </w:p>
         </w:tc>
@@ -10773,7 +10773,7 @@
                 <w:color w:val="000000"/>
                 <w:sz w:val="16"/>
               </w:rPr>
-              <w:t>787.434,87</w:t>
+              <w:t>799.394,87</w:t>
             </w:r>
           </w:p>
         </w:tc>
@@ -10800,7 +10800,7 @@
                 <w:color w:val="000000"/>
                 <w:sz w:val="16"/>
               </w:rPr>
-              <w:t>787.434,87</w:t>
+              <w:t>799.394,87</w:t>
             </w:r>
           </w:p>
         </w:tc>
@@ -10856,7 +10856,7 @@
                 <w:color w:val="000000"/>
                 <w:sz w:val="16"/>
               </w:rPr>
-              <w:t>4.376.483,47</w:t>
+              <w:t>4.396.217,47</w:t>
             </w:r>
           </w:p>
         </w:tc>
@@ -10883,7 +10883,7 @@
                 <w:color w:val="000000"/>
                 <w:sz w:val="16"/>
               </w:rPr>
-              <w:t>4.376.483,47</w:t>
+              <w:t>4.396.217,47</w:t>
             </w:r>
           </w:p>
         </w:tc>
@@ -10910,7 +10910,7 @@
                 <w:color w:val="000000"/>
                 <w:sz w:val="16"/>
               </w:rPr>
-              <w:t>4.376.483,47</w:t>
+              <w:t>4.396.217,47</w:t>
             </w:r>
           </w:p>
         </w:tc>
@@ -10937,7 +10937,7 @@
                 <w:color w:val="000000"/>
                 <w:sz w:val="16"/>
               </w:rPr>
-              <w:t>4.376.483,47</w:t>
+              <w:t>4.396.217,47</w:t>
             </w:r>
           </w:p>
         </w:tc>
@@ -10964,7 +10964,7 @@
                 <w:color w:val="000000"/>
                 <w:sz w:val="16"/>
               </w:rPr>
-              <w:t>4.376.483,47</w:t>
+              <w:t>4.396.217,47</w:t>
             </w:r>
           </w:p>
         </w:tc>
@@ -10991,7 +10991,7 @@
                 <w:color w:val="000000"/>
                 <w:sz w:val="16"/>
               </w:rPr>
-              <w:t>4.376.483,47</w:t>
+              <w:t>4.396.217,47</w:t>
             </w:r>
           </w:p>
         </w:tc>
@@ -11018,7 +11018,7 @@
                 <w:color w:val="000000"/>
                 <w:sz w:val="16"/>
               </w:rPr>
-              <w:t>4.376.483,47</w:t>
+              <w:t>4.396.217,47</w:t>
             </w:r>
           </w:p>
         </w:tc>
@@ -11045,7 +11045,7 @@
                 <w:color w:val="000000"/>
                 <w:sz w:val="16"/>
               </w:rPr>
-              <w:t>4.376.483,47</w:t>
+              <w:t>4.396.217,47</w:t>
             </w:r>
           </w:p>
         </w:tc>
@@ -11072,7 +11072,7 @@
                 <w:color w:val="000000"/>
                 <w:sz w:val="16"/>
               </w:rPr>
-              <w:t>4.376.483,47</w:t>
+              <w:t>4.396.217,47</w:t>
             </w:r>
           </w:p>
         </w:tc>
@@ -11099,7 +11099,7 @@
                 <w:color w:val="000000"/>
                 <w:sz w:val="16"/>
               </w:rPr>
-              <w:t>4.376.483,47</w:t>
+              <w:t>4.396.217,47</w:t>
             </w:r>
           </w:p>
         </w:tc>
@@ -11155,7 +11155,7 @@
                 <w:color w:val="000000"/>
                 <w:sz w:val="16"/>
               </w:rPr>
-              <w:t>2.943.516,53</w:t>
+              <w:t>2.923.782,53</w:t>
             </w:r>
           </w:p>
         </w:tc>
@@ -11182,7 +11182,7 @@
                 <w:color w:val="000000"/>
                 <w:sz w:val="16"/>
               </w:rPr>
-              <w:t>2.943.516,53</w:t>
+              <w:t>2.923.782,53</w:t>
             </w:r>
           </w:p>
         </w:tc>
@@ -11209,7 +11209,7 @@
                 <w:color w:val="000000"/>
                 <w:sz w:val="16"/>
               </w:rPr>
-              <w:t>2.943.516,53</w:t>
+              <w:t>2.923.782,53</w:t>
             </w:r>
           </w:p>
         </w:tc>
@@ -11236,7 +11236,7 @@
                 <w:color w:val="000000"/>
                 <w:sz w:val="16"/>
               </w:rPr>
-              <w:t>2.943.516,53</w:t>
+              <w:t>2.923.782,53</w:t>
             </w:r>
           </w:p>
         </w:tc>
@@ -11263,7 +11263,7 @@
                 <w:color w:val="000000"/>
                 <w:sz w:val="16"/>
               </w:rPr>
-              <w:t>2.943.516,53</w:t>
+              <w:t>2.923.782,53</w:t>
             </w:r>
           </w:p>
         </w:tc>
@@ -11290,7 +11290,7 @@
                 <w:color w:val="000000"/>
                 <w:sz w:val="16"/>
               </w:rPr>
-              <w:t>2.943.516,53</w:t>
+              <w:t>2.923.782,53</w:t>
             </w:r>
           </w:p>
         </w:tc>
@@ -11317,7 +11317,7 @@
                 <w:color w:val="000000"/>
                 <w:sz w:val="16"/>
               </w:rPr>
-              <w:t>2.943.516,53</w:t>
+              <w:t>2.923.782,53</w:t>
             </w:r>
           </w:p>
         </w:tc>
@@ -11344,7 +11344,7 @@
                 <w:color w:val="000000"/>
                 <w:sz w:val="16"/>
               </w:rPr>
-              <w:t>2.943.516,53</w:t>
+              <w:t>2.923.782,53</w:t>
             </w:r>
           </w:p>
         </w:tc>
@@ -11371,7 +11371,7 @@
                 <w:color w:val="000000"/>
                 <w:sz w:val="16"/>
               </w:rPr>
-              <w:t>2.943.516,53</w:t>
+              <w:t>2.923.782,53</w:t>
             </w:r>
           </w:p>
         </w:tc>
@@ -11398,7 +11398,7 @@
                 <w:color w:val="000000"/>
                 <w:sz w:val="16"/>
               </w:rPr>
-              <w:t>2.943.516,53</w:t>
+              <w:t>2.923.782,53</w:t>
             </w:r>
           </w:p>
         </w:tc>
@@ -11454,7 +11454,7 @@
                 <w:color w:val="000000"/>
                 <w:sz w:val="16"/>
               </w:rPr>
-              <w:t>787.434,87</w:t>
+              <w:t>799.394,87</w:t>
             </w:r>
           </w:p>
         </w:tc>
@@ -11481,7 +11481,7 @@
                 <w:color w:val="000000"/>
                 <w:sz w:val="16"/>
               </w:rPr>
-              <w:t>787.434,87</w:t>
+              <w:t>799.394,87</w:t>
             </w:r>
           </w:p>
         </w:tc>
@@ -11508,7 +11508,7 @@
                 <w:color w:val="000000"/>
                 <w:sz w:val="16"/>
               </w:rPr>
-              <w:t>787.434,87</w:t>
+              <w:t>799.394,87</w:t>
             </w:r>
           </w:p>
         </w:tc>
@@ -11535,7 +11535,7 @@
                 <w:color w:val="000000"/>
                 <w:sz w:val="16"/>
               </w:rPr>
-              <w:t>787.434,87</w:t>
+              <w:t>799.394,87</w:t>
             </w:r>
           </w:p>
         </w:tc>
@@ -11562,7 +11562,7 @@
                 <w:color w:val="000000"/>
                 <w:sz w:val="16"/>
               </w:rPr>
-              <w:t>787.434,87</w:t>
+              <w:t>799.394,87</w:t>
             </w:r>
           </w:p>
         </w:tc>
@@ -11589,7 +11589,7 @@
                 <w:color w:val="000000"/>
                 <w:sz w:val="16"/>
               </w:rPr>
-              <w:t>787.434,87</w:t>
+              <w:t>799.394,87</w:t>
             </w:r>
           </w:p>
         </w:tc>
@@ -11616,7 +11616,7 @@
                 <w:color w:val="000000"/>
                 <w:sz w:val="16"/>
               </w:rPr>
-              <w:t>787.434,87</w:t>
+              <w:t>799.394,87</w:t>
             </w:r>
           </w:p>
         </w:tc>
@@ -11643,7 +11643,7 @@
                 <w:color w:val="000000"/>
                 <w:sz w:val="16"/>
               </w:rPr>
-              <w:t>787.434,87</w:t>
+              <w:t>799.394,87</w:t>
             </w:r>
           </w:p>
         </w:tc>
@@ -11670,7 +11670,7 @@
                 <w:color w:val="000000"/>
                 <w:sz w:val="16"/>
               </w:rPr>
-              <w:t>787.434,87</w:t>
+              <w:t>799.394,87</w:t>
             </w:r>
           </w:p>
         </w:tc>
@@ -11697,7 +11697,7 @@
                 <w:color w:val="000000"/>
                 <w:sz w:val="16"/>
               </w:rPr>
-              <w:t>787.434,87</w:t>
+              <w:t>799.394,87</w:t>
             </w:r>
           </w:p>
         </w:tc>
@@ -11753,7 +11753,7 @@
                 <w:color w:val="000000"/>
                 <w:sz w:val="16"/>
               </w:rPr>
-              <w:t>3.730.951,40</w:t>
+              <w:t>3.723.177,40</w:t>
             </w:r>
           </w:p>
         </w:tc>
@@ -11780,7 +11780,7 @@
                 <w:color w:val="000000"/>
                 <w:sz w:val="16"/>
               </w:rPr>
-              <w:t>3.730.951,40</w:t>
+              <w:t>3.723.177,40</w:t>
             </w:r>
           </w:p>
         </w:tc>
@@ -11807,7 +11807,7 @@
                 <w:color w:val="000000"/>
                 <w:sz w:val="16"/>
               </w:rPr>
-              <w:t>3.730.951,40</w:t>
+              <w:t>3.723.177,40</w:t>
             </w:r>
           </w:p>
         </w:tc>
@@ -11834,7 +11834,7 @@
                 <w:color w:val="000000"/>
                 <w:sz w:val="16"/>
               </w:rPr>
-              <w:t>3.730.951,40</w:t>
+              <w:t>3.723.177,40</w:t>
             </w:r>
           </w:p>
         </w:tc>
@@ -11861,7 +11861,7 @@
                 <w:color w:val="000000"/>
                 <w:sz w:val="16"/>
               </w:rPr>
-              <w:t>3.730.951,40</w:t>
+              <w:t>3.723.177,40</w:t>
             </w:r>
           </w:p>
         </w:tc>
@@ -11888,7 +11888,7 @@
                 <w:color w:val="000000"/>
                 <w:sz w:val="16"/>
               </w:rPr>
-              <w:t>3.730.951,40</w:t>
+              <w:t>3.723.177,40</w:t>
             </w:r>
           </w:p>
         </w:tc>
@@ -11915,7 +11915,7 @@
                 <w:color w:val="000000"/>
                 <w:sz w:val="16"/>
               </w:rPr>
-              <w:t>3.730.951,40</w:t>
+              <w:t>3.723.177,40</w:t>
             </w:r>
           </w:p>
         </w:tc>
@@ -11942,7 +11942,7 @@
                 <w:color w:val="000000"/>
                 <w:sz w:val="16"/>
               </w:rPr>
-              <w:t>3.730.951,40</w:t>
+              <w:t>3.723.177,40</w:t>
             </w:r>
           </w:p>
         </w:tc>
@@ -11969,7 +11969,7 @@
                 <w:color w:val="000000"/>
                 <w:sz w:val="16"/>
               </w:rPr>
-              <w:t>3.730.951,40</w:t>
+              <w:t>3.723.177,40</w:t>
             </w:r>
           </w:p>
         </w:tc>
@@ -11996,7 +11996,7 @@
                 <w:color w:val="000000"/>
                 <w:sz w:val="16"/>
               </w:rPr>
-              <w:t>3.730.951,40</w:t>
+              <w:t>3.723.177,40</w:t>
             </w:r>
           </w:p>
         </w:tc>
@@ -12132,7 +12132,7 @@
                 <w:color w:val="000000"/>
                 <w:sz w:val="16"/>
               </w:rPr>
-              <w:t>24.988.354,46 TL</w:t>
+              <w:t>25.586.354,46 TL</w:t>
             </w:r>
           </w:p>
         </w:tc>
@@ -12244,7 +12244,7 @@
                 <w:color w:val="000000"/>
                 <w:sz w:val="16"/>
               </w:rPr>
-              <w:t>14.734.959,03 TL</w:t>
+              <w:t>15.332.959,03 TL</w:t>
             </w:r>
           </w:p>
         </w:tc>
@@ -12300,7 +12300,7 @@
                 <w:color w:val="000000"/>
                 <w:sz w:val="16"/>
               </w:rPr>
-              <w:t>3.730.951,40 TL</w:t>
+              <w:t>3.723.177,40 TL</w:t>
             </w:r>
           </w:p>
         </w:tc>
@@ -12356,7 +12356,7 @@
                 <w:color w:val="000000"/>
                 <w:sz w:val="16"/>
               </w:rPr>
-              <w:t>3,9 yıl</w:t>
+              <w:t>4,1 yıl</w:t>
             </w:r>
           </w:p>
         </w:tc>
@@ -12412,7 +12412,7 @@
                 <w:color w:val="000000"/>
                 <w:sz w:val="16"/>
               </w:rPr>
-              <w:t>2.943.516,53 TL</w:t>
+              <w:t>2.923.782,53 TL</w:t>
             </w:r>
           </w:p>
         </w:tc>

</xml_diff>

<commit_message>
Yayin: sihhi tesisattan bes kalem cikarildi
Co-Authored-By: Claude Opus 5 <noreply@anthropic.com>
Claude-Session: https://claude.ai/code/session_01HJPp6bx7wepUX5p8fxGcjg
</commit_message>
<xml_diff>
--- a/belgeler/45_B2_IS_PLANI.docx
+++ b/belgeler/45_B2_IS_PLANI.docx
@@ -2618,7 +2618,7 @@
                 <w:color w:val="000000"/>
                 <w:sz w:val="16"/>
               </w:rPr>
-              <w:t>6.216.052,75</w:t>
+              <w:t>5.867.052,75</w:t>
             </w:r>
           </w:p>
         </w:tc>
@@ -2645,7 +2645,7 @@
                 <w:color w:val="000000"/>
                 <w:sz w:val="16"/>
               </w:rPr>
-              <w:t>117.821</w:t>
+              <w:t>111.206</w:t>
             </w:r>
           </w:p>
         </w:tc>
@@ -2948,7 +2948,7 @@
                 <w:color w:val="000000"/>
                 <w:sz w:val="16"/>
               </w:rPr>
-              <w:t>25.586.354,46</w:t>
+              <w:t>25.237.354,46</w:t>
             </w:r>
           </w:p>
         </w:tc>
@@ -2975,7 +2975,7 @@
                 <w:color w:val="000000"/>
                 <w:sz w:val="16"/>
               </w:rPr>
-              <w:t>484.971</w:t>
+              <w:t>478.356</w:t>
             </w:r>
           </w:p>
         </w:tc>
@@ -3157,7 +3157,7 @@
                 <w:color w:val="000000"/>
                 <w:sz w:val="16"/>
               </w:rPr>
-              <w:t>25.586.354,46</w:t>
+              <w:t>25.237.354,46</w:t>
             </w:r>
           </w:p>
         </w:tc>
@@ -5794,7 +5794,7 @@
           <w:color w:val="000000"/>
           <w:sz w:val="18"/>
         </w:rPr>
-        <w:t>513.831,80 TL</w:t>
+        <w:t>513.183,66 TL</w:t>
       </w:r>
       <w:r>
         <w:rPr>
@@ -6621,7 +6621,7 @@
                 <w:color w:val="000000"/>
                 <w:sz w:val="16"/>
               </w:rPr>
-              <w:t>1.093.063,54</w:t>
+              <w:t>1.089.573,54</w:t>
             </w:r>
           </w:p>
         </w:tc>
@@ -6704,7 +6704,7 @@
                 <w:color w:val="000000"/>
                 <w:sz w:val="16"/>
               </w:rPr>
-              <w:t>256.759,06</w:t>
+              <w:t>255.712,06</w:t>
             </w:r>
           </w:p>
         </w:tc>
@@ -6953,7 +6953,7 @@
                 <w:color w:val="000000"/>
                 <w:sz w:val="16"/>
               </w:rPr>
-              <w:t>3.596.822,60</w:t>
+              <w:t>3.592.285,60</w:t>
             </w:r>
           </w:p>
         </w:tc>
@@ -7179,7 +7179,7 @@
                 <w:color w:val="000000"/>
                 <w:sz w:val="16"/>
               </w:rPr>
-              <w:t>21.990.507,25</w:t>
+              <w:t>21.641.507,25</w:t>
             </w:r>
           </w:p>
         </w:tc>
@@ -7233,7 +7233,7 @@
                 <w:color w:val="000000"/>
                 <w:sz w:val="16"/>
               </w:rPr>
-              <w:t>439.810,15</w:t>
+              <w:t>432.830,15</w:t>
             </w:r>
           </w:p>
         </w:tc>
@@ -7399,7 +7399,7 @@
                 <w:color w:val="000000"/>
                 <w:sz w:val="16"/>
               </w:rPr>
-              <w:t>25.586.354,46</w:t>
+              <w:t>25.237.354,46</w:t>
             </w:r>
           </w:p>
         </w:tc>
@@ -7443,7 +7443,7 @@
                 <w:color w:val="000000"/>
                 <w:sz w:val="16"/>
               </w:rPr>
-              <w:t>799.394,87</w:t>
+              <w:t>792.414,87</w:t>
             </w:r>
           </w:p>
         </w:tc>
@@ -9361,7 +9361,7 @@
                 <w:color w:val="000000"/>
                 <w:sz w:val="16"/>
               </w:rPr>
-              <w:t>1.093.063,54</w:t>
+              <w:t>1.089.573,54</w:t>
             </w:r>
           </w:p>
         </w:tc>
@@ -9388,7 +9388,7 @@
                 <w:color w:val="000000"/>
                 <w:sz w:val="16"/>
               </w:rPr>
-              <w:t>1.093.063,54</w:t>
+              <w:t>1.089.573,54</w:t>
             </w:r>
           </w:p>
         </w:tc>
@@ -9415,7 +9415,7 @@
                 <w:color w:val="000000"/>
                 <w:sz w:val="16"/>
               </w:rPr>
-              <w:t>1.093.063,54</w:t>
+              <w:t>1.089.573,54</w:t>
             </w:r>
           </w:p>
         </w:tc>
@@ -9442,7 +9442,7 @@
                 <w:color w:val="000000"/>
                 <w:sz w:val="16"/>
               </w:rPr>
-              <w:t>1.093.063,54</w:t>
+              <w:t>1.089.573,54</w:t>
             </w:r>
           </w:p>
         </w:tc>
@@ -9469,7 +9469,7 @@
                 <w:color w:val="000000"/>
                 <w:sz w:val="16"/>
               </w:rPr>
-              <w:t>1.093.063,54</w:t>
+              <w:t>1.089.573,54</w:t>
             </w:r>
           </w:p>
         </w:tc>
@@ -9496,7 +9496,7 @@
                 <w:color w:val="000000"/>
                 <w:sz w:val="16"/>
               </w:rPr>
-              <w:t>1.093.063,54</w:t>
+              <w:t>1.089.573,54</w:t>
             </w:r>
           </w:p>
         </w:tc>
@@ -9523,7 +9523,7 @@
                 <w:color w:val="000000"/>
                 <w:sz w:val="16"/>
               </w:rPr>
-              <w:t>1.093.063,54</w:t>
+              <w:t>1.089.573,54</w:t>
             </w:r>
           </w:p>
         </w:tc>
@@ -9550,7 +9550,7 @@
                 <w:color w:val="000000"/>
                 <w:sz w:val="16"/>
               </w:rPr>
-              <w:t>1.093.063,54</w:t>
+              <w:t>1.089.573,54</w:t>
             </w:r>
           </w:p>
         </w:tc>
@@ -9577,7 +9577,7 @@
                 <w:color w:val="000000"/>
                 <w:sz w:val="16"/>
               </w:rPr>
-              <w:t>1.093.063,54</w:t>
+              <w:t>1.089.573,54</w:t>
             </w:r>
           </w:p>
         </w:tc>
@@ -9604,7 +9604,7 @@
                 <w:color w:val="000000"/>
                 <w:sz w:val="16"/>
               </w:rPr>
-              <w:t>1.093.063,54</w:t>
+              <w:t>1.089.573,54</w:t>
             </w:r>
           </w:p>
         </w:tc>
@@ -9660,7 +9660,7 @@
                 <w:color w:val="000000"/>
                 <w:sz w:val="16"/>
               </w:rPr>
-              <w:t>256.759,06</w:t>
+              <w:t>255.712,06</w:t>
             </w:r>
           </w:p>
         </w:tc>
@@ -9687,7 +9687,7 @@
                 <w:color w:val="000000"/>
                 <w:sz w:val="16"/>
               </w:rPr>
-              <w:t>256.759,06</w:t>
+              <w:t>255.712,06</w:t>
             </w:r>
           </w:p>
         </w:tc>
@@ -9714,7 +9714,7 @@
                 <w:color w:val="000000"/>
                 <w:sz w:val="16"/>
               </w:rPr>
-              <w:t>256.759,06</w:t>
+              <w:t>255.712,06</w:t>
             </w:r>
           </w:p>
         </w:tc>
@@ -9741,7 +9741,7 @@
                 <w:color w:val="000000"/>
                 <w:sz w:val="16"/>
               </w:rPr>
-              <w:t>256.759,06</w:t>
+              <w:t>255.712,06</w:t>
             </w:r>
           </w:p>
         </w:tc>
@@ -9768,7 +9768,7 @@
                 <w:color w:val="000000"/>
                 <w:sz w:val="16"/>
               </w:rPr>
-              <w:t>256.759,06</w:t>
+              <w:t>255.712,06</w:t>
             </w:r>
           </w:p>
         </w:tc>
@@ -9795,7 +9795,7 @@
                 <w:color w:val="000000"/>
                 <w:sz w:val="16"/>
               </w:rPr>
-              <w:t>256.759,06</w:t>
+              <w:t>255.712,06</w:t>
             </w:r>
           </w:p>
         </w:tc>
@@ -9822,7 +9822,7 @@
                 <w:color w:val="000000"/>
                 <w:sz w:val="16"/>
               </w:rPr>
-              <w:t>256.759,06</w:t>
+              <w:t>255.712,06</w:t>
             </w:r>
           </w:p>
         </w:tc>
@@ -9849,7 +9849,7 @@
                 <w:color w:val="000000"/>
                 <w:sz w:val="16"/>
               </w:rPr>
-              <w:t>256.759,06</w:t>
+              <w:t>255.712,06</w:t>
             </w:r>
           </w:p>
         </w:tc>
@@ -9876,7 +9876,7 @@
                 <w:color w:val="000000"/>
                 <w:sz w:val="16"/>
               </w:rPr>
-              <w:t>256.759,06</w:t>
+              <w:t>255.712,06</w:t>
             </w:r>
           </w:p>
         </w:tc>
@@ -9903,7 +9903,7 @@
                 <w:color w:val="000000"/>
                 <w:sz w:val="16"/>
               </w:rPr>
-              <w:t>256.759,06</w:t>
+              <w:t>255.712,06</w:t>
             </w:r>
           </w:p>
         </w:tc>
@@ -10557,7 +10557,7 @@
                 <w:color w:val="000000"/>
                 <w:sz w:val="16"/>
               </w:rPr>
-              <w:t>799.394,87</w:t>
+              <w:t>792.414,87</w:t>
             </w:r>
           </w:p>
         </w:tc>
@@ -10584,7 +10584,7 @@
                 <w:color w:val="000000"/>
                 <w:sz w:val="16"/>
               </w:rPr>
-              <w:t>799.394,87</w:t>
+              <w:t>792.414,87</w:t>
             </w:r>
           </w:p>
         </w:tc>
@@ -10611,7 +10611,7 @@
                 <w:color w:val="000000"/>
                 <w:sz w:val="16"/>
               </w:rPr>
-              <w:t>799.394,87</w:t>
+              <w:t>792.414,87</w:t>
             </w:r>
           </w:p>
         </w:tc>
@@ -10638,7 +10638,7 @@
                 <w:color w:val="000000"/>
                 <w:sz w:val="16"/>
               </w:rPr>
-              <w:t>799.394,87</w:t>
+              <w:t>792.414,87</w:t>
             </w:r>
           </w:p>
         </w:tc>
@@ -10665,7 +10665,7 @@
                 <w:color w:val="000000"/>
                 <w:sz w:val="16"/>
               </w:rPr>
-              <w:t>799.394,87</w:t>
+              <w:t>792.414,87</w:t>
             </w:r>
           </w:p>
         </w:tc>
@@ -10692,7 +10692,7 @@
                 <w:color w:val="000000"/>
                 <w:sz w:val="16"/>
               </w:rPr>
-              <w:t>799.394,87</w:t>
+              <w:t>792.414,87</w:t>
             </w:r>
           </w:p>
         </w:tc>
@@ -10719,7 +10719,7 @@
                 <w:color w:val="000000"/>
                 <w:sz w:val="16"/>
               </w:rPr>
-              <w:t>799.394,87</w:t>
+              <w:t>792.414,87</w:t>
             </w:r>
           </w:p>
         </w:tc>
@@ -10746,7 +10746,7 @@
                 <w:color w:val="000000"/>
                 <w:sz w:val="16"/>
               </w:rPr>
-              <w:t>799.394,87</w:t>
+              <w:t>792.414,87</w:t>
             </w:r>
           </w:p>
         </w:tc>
@@ -10773,7 +10773,7 @@
                 <w:color w:val="000000"/>
                 <w:sz w:val="16"/>
               </w:rPr>
-              <w:t>799.394,87</w:t>
+              <w:t>792.414,87</w:t>
             </w:r>
           </w:p>
         </w:tc>
@@ -10800,7 +10800,7 @@
                 <w:color w:val="000000"/>
                 <w:sz w:val="16"/>
               </w:rPr>
-              <w:t>799.394,87</w:t>
+              <w:t>792.414,87</w:t>
             </w:r>
           </w:p>
         </w:tc>
@@ -10856,7 +10856,7 @@
                 <w:color w:val="000000"/>
                 <w:sz w:val="16"/>
               </w:rPr>
-              <w:t>4.396.217,47</w:t>
+              <w:t>4.384.700,47</w:t>
             </w:r>
           </w:p>
         </w:tc>
@@ -10883,7 +10883,7 @@
                 <w:color w:val="000000"/>
                 <w:sz w:val="16"/>
               </w:rPr>
-              <w:t>4.396.217,47</w:t>
+              <w:t>4.384.700,47</w:t>
             </w:r>
           </w:p>
         </w:tc>
@@ -10910,7 +10910,7 @@
                 <w:color w:val="000000"/>
                 <w:sz w:val="16"/>
               </w:rPr>
-              <w:t>4.396.217,47</w:t>
+              <w:t>4.384.700,47</w:t>
             </w:r>
           </w:p>
         </w:tc>
@@ -10937,7 +10937,7 @@
                 <w:color w:val="000000"/>
                 <w:sz w:val="16"/>
               </w:rPr>
-              <w:t>4.396.217,47</w:t>
+              <w:t>4.384.700,47</w:t>
             </w:r>
           </w:p>
         </w:tc>
@@ -10964,7 +10964,7 @@
                 <w:color w:val="000000"/>
                 <w:sz w:val="16"/>
               </w:rPr>
-              <w:t>4.396.217,47</w:t>
+              <w:t>4.384.700,47</w:t>
             </w:r>
           </w:p>
         </w:tc>
@@ -10991,7 +10991,7 @@
                 <w:color w:val="000000"/>
                 <w:sz w:val="16"/>
               </w:rPr>
-              <w:t>4.396.217,47</w:t>
+              <w:t>4.384.700,47</w:t>
             </w:r>
           </w:p>
         </w:tc>
@@ -11018,7 +11018,7 @@
                 <w:color w:val="000000"/>
                 <w:sz w:val="16"/>
               </w:rPr>
-              <w:t>4.396.217,47</w:t>
+              <w:t>4.384.700,47</w:t>
             </w:r>
           </w:p>
         </w:tc>
@@ -11045,7 +11045,7 @@
                 <w:color w:val="000000"/>
                 <w:sz w:val="16"/>
               </w:rPr>
-              <w:t>4.396.217,47</w:t>
+              <w:t>4.384.700,47</w:t>
             </w:r>
           </w:p>
         </w:tc>
@@ -11072,7 +11072,7 @@
                 <w:color w:val="000000"/>
                 <w:sz w:val="16"/>
               </w:rPr>
-              <w:t>4.396.217,47</w:t>
+              <w:t>4.384.700,47</w:t>
             </w:r>
           </w:p>
         </w:tc>
@@ -11099,7 +11099,7 @@
                 <w:color w:val="000000"/>
                 <w:sz w:val="16"/>
               </w:rPr>
-              <w:t>4.396.217,47</w:t>
+              <w:t>4.384.700,47</w:t>
             </w:r>
           </w:p>
         </w:tc>
@@ -11155,7 +11155,7 @@
                 <w:color w:val="000000"/>
                 <w:sz w:val="16"/>
               </w:rPr>
-              <w:t>2.923.782,53</w:t>
+              <w:t>2.935.299,53</w:t>
             </w:r>
           </w:p>
         </w:tc>
@@ -11182,7 +11182,7 @@
                 <w:color w:val="000000"/>
                 <w:sz w:val="16"/>
               </w:rPr>
-              <w:t>2.923.782,53</w:t>
+              <w:t>2.935.299,53</w:t>
             </w:r>
           </w:p>
         </w:tc>
@@ -11209,7 +11209,7 @@
                 <w:color w:val="000000"/>
                 <w:sz w:val="16"/>
               </w:rPr>
-              <w:t>2.923.782,53</w:t>
+              <w:t>2.935.299,53</w:t>
             </w:r>
           </w:p>
         </w:tc>
@@ -11236,7 +11236,7 @@
                 <w:color w:val="000000"/>
                 <w:sz w:val="16"/>
               </w:rPr>
-              <w:t>2.923.782,53</w:t>
+              <w:t>2.935.299,53</w:t>
             </w:r>
           </w:p>
         </w:tc>
@@ -11263,7 +11263,7 @@
                 <w:color w:val="000000"/>
                 <w:sz w:val="16"/>
               </w:rPr>
-              <w:t>2.923.782,53</w:t>
+              <w:t>2.935.299,53</w:t>
             </w:r>
           </w:p>
         </w:tc>
@@ -11290,7 +11290,7 @@
                 <w:color w:val="000000"/>
                 <w:sz w:val="16"/>
               </w:rPr>
-              <w:t>2.923.782,53</w:t>
+              <w:t>2.935.299,53</w:t>
             </w:r>
           </w:p>
         </w:tc>
@@ -11317,7 +11317,7 @@
                 <w:color w:val="000000"/>
                 <w:sz w:val="16"/>
               </w:rPr>
-              <w:t>2.923.782,53</w:t>
+              <w:t>2.935.299,53</w:t>
             </w:r>
           </w:p>
         </w:tc>
@@ -11344,7 +11344,7 @@
                 <w:color w:val="000000"/>
                 <w:sz w:val="16"/>
               </w:rPr>
-              <w:t>2.923.782,53</w:t>
+              <w:t>2.935.299,53</w:t>
             </w:r>
           </w:p>
         </w:tc>
@@ -11371,7 +11371,7 @@
                 <w:color w:val="000000"/>
                 <w:sz w:val="16"/>
               </w:rPr>
-              <w:t>2.923.782,53</w:t>
+              <w:t>2.935.299,53</w:t>
             </w:r>
           </w:p>
         </w:tc>
@@ -11398,7 +11398,7 @@
                 <w:color w:val="000000"/>
                 <w:sz w:val="16"/>
               </w:rPr>
-              <w:t>2.923.782,53</w:t>
+              <w:t>2.935.299,53</w:t>
             </w:r>
           </w:p>
         </w:tc>
@@ -11454,7 +11454,7 @@
                 <w:color w:val="000000"/>
                 <w:sz w:val="16"/>
               </w:rPr>
-              <w:t>799.394,87</w:t>
+              <w:t>792.414,87</w:t>
             </w:r>
           </w:p>
         </w:tc>
@@ -11481,7 +11481,7 @@
                 <w:color w:val="000000"/>
                 <w:sz w:val="16"/>
               </w:rPr>
-              <w:t>799.394,87</w:t>
+              <w:t>792.414,87</w:t>
             </w:r>
           </w:p>
         </w:tc>
@@ -11508,7 +11508,7 @@
                 <w:color w:val="000000"/>
                 <w:sz w:val="16"/>
               </w:rPr>
-              <w:t>799.394,87</w:t>
+              <w:t>792.414,87</w:t>
             </w:r>
           </w:p>
         </w:tc>
@@ -11535,7 +11535,7 @@
                 <w:color w:val="000000"/>
                 <w:sz w:val="16"/>
               </w:rPr>
-              <w:t>799.394,87</w:t>
+              <w:t>792.414,87</w:t>
             </w:r>
           </w:p>
         </w:tc>
@@ -11562,7 +11562,7 @@
                 <w:color w:val="000000"/>
                 <w:sz w:val="16"/>
               </w:rPr>
-              <w:t>799.394,87</w:t>
+              <w:t>792.414,87</w:t>
             </w:r>
           </w:p>
         </w:tc>
@@ -11589,7 +11589,7 @@
                 <w:color w:val="000000"/>
                 <w:sz w:val="16"/>
               </w:rPr>
-              <w:t>799.394,87</w:t>
+              <w:t>792.414,87</w:t>
             </w:r>
           </w:p>
         </w:tc>
@@ -11616,7 +11616,7 @@
                 <w:color w:val="000000"/>
                 <w:sz w:val="16"/>
               </w:rPr>
-              <w:t>799.394,87</w:t>
+              <w:t>792.414,87</w:t>
             </w:r>
           </w:p>
         </w:tc>
@@ -11643,7 +11643,7 @@
                 <w:color w:val="000000"/>
                 <w:sz w:val="16"/>
               </w:rPr>
-              <w:t>799.394,87</w:t>
+              <w:t>792.414,87</w:t>
             </w:r>
           </w:p>
         </w:tc>
@@ -11670,7 +11670,7 @@
                 <w:color w:val="000000"/>
                 <w:sz w:val="16"/>
               </w:rPr>
-              <w:t>799.394,87</w:t>
+              <w:t>792.414,87</w:t>
             </w:r>
           </w:p>
         </w:tc>
@@ -11697,7 +11697,7 @@
                 <w:color w:val="000000"/>
                 <w:sz w:val="16"/>
               </w:rPr>
-              <w:t>799.394,87</w:t>
+              <w:t>792.414,87</w:t>
             </w:r>
           </w:p>
         </w:tc>
@@ -11753,7 +11753,7 @@
                 <w:color w:val="000000"/>
                 <w:sz w:val="16"/>
               </w:rPr>
-              <w:t>3.723.177,40</w:t>
+              <w:t>3.727.714,40</w:t>
             </w:r>
           </w:p>
         </w:tc>
@@ -11780,7 +11780,7 @@
                 <w:color w:val="000000"/>
                 <w:sz w:val="16"/>
               </w:rPr>
-              <w:t>3.723.177,40</w:t>
+              <w:t>3.727.714,40</w:t>
             </w:r>
           </w:p>
         </w:tc>
@@ -11807,7 +11807,7 @@
                 <w:color w:val="000000"/>
                 <w:sz w:val="16"/>
               </w:rPr>
-              <w:t>3.723.177,40</w:t>
+              <w:t>3.727.714,40</w:t>
             </w:r>
           </w:p>
         </w:tc>
@@ -11834,7 +11834,7 @@
                 <w:color w:val="000000"/>
                 <w:sz w:val="16"/>
               </w:rPr>
-              <w:t>3.723.177,40</w:t>
+              <w:t>3.727.714,40</w:t>
             </w:r>
           </w:p>
         </w:tc>
@@ -11861,7 +11861,7 @@
                 <w:color w:val="000000"/>
                 <w:sz w:val="16"/>
               </w:rPr>
-              <w:t>3.723.177,40</w:t>
+              <w:t>3.727.714,40</w:t>
             </w:r>
           </w:p>
         </w:tc>
@@ -11888,7 +11888,7 @@
                 <w:color w:val="000000"/>
                 <w:sz w:val="16"/>
               </w:rPr>
-              <w:t>3.723.177,40</w:t>
+              <w:t>3.727.714,40</w:t>
             </w:r>
           </w:p>
         </w:tc>
@@ -11915,7 +11915,7 @@
                 <w:color w:val="000000"/>
                 <w:sz w:val="16"/>
               </w:rPr>
-              <w:t>3.723.177,40</w:t>
+              <w:t>3.727.714,40</w:t>
             </w:r>
           </w:p>
         </w:tc>
@@ -11942,7 +11942,7 @@
                 <w:color w:val="000000"/>
                 <w:sz w:val="16"/>
               </w:rPr>
-              <w:t>3.723.177,40</w:t>
+              <w:t>3.727.714,40</w:t>
             </w:r>
           </w:p>
         </w:tc>
@@ -11969,7 +11969,7 @@
                 <w:color w:val="000000"/>
                 <w:sz w:val="16"/>
               </w:rPr>
-              <w:t>3.723.177,40</w:t>
+              <w:t>3.727.714,40</w:t>
             </w:r>
           </w:p>
         </w:tc>
@@ -11996,7 +11996,7 @@
                 <w:color w:val="000000"/>
                 <w:sz w:val="16"/>
               </w:rPr>
-              <w:t>3.723.177,40</w:t>
+              <w:t>3.727.714,40</w:t>
             </w:r>
           </w:p>
         </w:tc>
@@ -12132,7 +12132,7 @@
                 <w:color w:val="000000"/>
                 <w:sz w:val="16"/>
               </w:rPr>
-              <w:t>25.586.354,46 TL</w:t>
+              <w:t>25.237.354,46 TL</w:t>
             </w:r>
           </w:p>
         </w:tc>
@@ -12244,7 +12244,7 @@
                 <w:color w:val="000000"/>
                 <w:sz w:val="16"/>
               </w:rPr>
-              <w:t>15.332.959,03 TL</w:t>
+              <w:t>14.983.959,03 TL</w:t>
             </w:r>
           </w:p>
         </w:tc>
@@ -12300,7 +12300,7 @@
                 <w:color w:val="000000"/>
                 <w:sz w:val="16"/>
               </w:rPr>
-              <w:t>3.723.177,40 TL</w:t>
+              <w:t>3.727.714,40 TL</w:t>
             </w:r>
           </w:p>
         </w:tc>
@@ -12356,7 +12356,7 @@
                 <w:color w:val="000000"/>
                 <w:sz w:val="16"/>
               </w:rPr>
-              <w:t>4,1 yıl</w:t>
+              <w:t>4,0 yıl</w:t>
             </w:r>
           </w:p>
         </w:tc>
@@ -12412,7 +12412,7 @@
                 <w:color w:val="000000"/>
                 <w:sz w:val="16"/>
               </w:rPr>
-              <w:t>2.923.782,53 TL</w:t>
+              <w:t>2.935.299,53 TL</w:t>
             </w:r>
           </w:p>
         </w:tc>

</xml_diff>